<commit_message>
Subiendo correcion de code smells , Magic Strings , Type Safety Hazard y Unecessary Code
</commit_message>
<xml_diff>
--- a/docs/historias de usuario.docx
+++ b/docs/historias de usuario.docx
@@ -164,14 +164,23 @@
       </w:pPr>
     </w:p>
     <w:p>
-      <w:r>
-        <w:rPr>
-          <w:b/>
-          <w:bCs/>
+      <w:pPr>
+        <w:rPr>
+          <w:color w:val="EE0000"/>
+        </w:rPr>
+      </w:pPr>
+      <w:r>
+        <w:rPr>
+          <w:b/>
+          <w:bCs/>
+          <w:color w:val="EE0000"/>
         </w:rPr>
         <w:t>HU-02</w:t>
       </w:r>
       <w:r>
+        <w:rPr>
+          <w:color w:val="EE0000"/>
+        </w:rPr>
         <w:t xml:space="preserve"> </w:t>
       </w:r>
     </w:p>
@@ -470,14 +479,23 @@
       </w:pPr>
     </w:p>
     <w:p>
-      <w:r>
-        <w:rPr>
-          <w:b/>
-          <w:bCs/>
+      <w:pPr>
+        <w:rPr>
+          <w:color w:val="EE0000"/>
+        </w:rPr>
+      </w:pPr>
+      <w:r>
+        <w:rPr>
+          <w:b/>
+          <w:bCs/>
+          <w:color w:val="EE0000"/>
         </w:rPr>
         <w:t>HU-04</w:t>
       </w:r>
       <w:r>
+        <w:rPr>
+          <w:color w:val="EE0000"/>
+        </w:rPr>
         <w:t xml:space="preserve"> </w:t>
       </w:r>
     </w:p>
@@ -619,14 +637,23 @@
     </w:p>
     <w:p/>
     <w:p>
-      <w:r>
-        <w:rPr>
-          <w:b/>
-          <w:bCs/>
+      <w:pPr>
+        <w:rPr>
+          <w:color w:val="EE0000"/>
+        </w:rPr>
+      </w:pPr>
+      <w:r>
+        <w:rPr>
+          <w:b/>
+          <w:bCs/>
+          <w:color w:val="EE0000"/>
         </w:rPr>
         <w:t>HU-05</w:t>
       </w:r>
       <w:r>
+        <w:rPr>
+          <w:color w:val="EE0000"/>
+        </w:rPr>
         <w:t xml:space="preserve"> </w:t>
       </w:r>
     </w:p>
@@ -768,14 +795,23 @@
     </w:p>
     <w:p/>
     <w:p>
-      <w:r>
-        <w:rPr>
-          <w:b/>
-          <w:bCs/>
+      <w:pPr>
+        <w:rPr>
+          <w:color w:val="EE0000"/>
+        </w:rPr>
+      </w:pPr>
+      <w:r>
+        <w:rPr>
+          <w:b/>
+          <w:bCs/>
+          <w:color w:val="EE0000"/>
         </w:rPr>
         <w:t>HU-06</w:t>
       </w:r>
       <w:r>
+        <w:rPr>
+          <w:color w:val="EE0000"/>
+        </w:rPr>
         <w:t xml:space="preserve"> </w:t>
       </w:r>
     </w:p>
@@ -924,12 +960,14 @@
         <w:rPr>
           <w:b/>
           <w:bCs/>
-        </w:rPr>
-      </w:pPr>
-      <w:r>
-        <w:rPr>
-          <w:b/>
-          <w:bCs/>
+          <w:color w:val="EE0000"/>
+        </w:rPr>
+      </w:pPr>
+      <w:r>
+        <w:rPr>
+          <w:b/>
+          <w:bCs/>
+          <w:color w:val="EE0000"/>
         </w:rPr>
         <w:t>HU-07</w:t>
       </w:r>
@@ -1221,16 +1259,31 @@
       </w:r>
     </w:p>
     <w:p/>
-    <w:p/>
-    <w:p>
-      <w:r>
-        <w:rPr>
-          <w:b/>
-          <w:bCs/>
+    <w:p>
+      <w:pPr>
+        <w:rPr>
+          <w:color w:val="EE0000"/>
+        </w:rPr>
+      </w:pPr>
+    </w:p>
+    <w:p>
+      <w:pPr>
+        <w:rPr>
+          <w:color w:val="EE0000"/>
+        </w:rPr>
+      </w:pPr>
+      <w:r>
+        <w:rPr>
+          <w:b/>
+          <w:bCs/>
+          <w:color w:val="EE0000"/>
         </w:rPr>
         <w:t>HU-09</w:t>
       </w:r>
       <w:r>
+        <w:rPr>
+          <w:color w:val="EE0000"/>
+        </w:rPr>
         <w:t xml:space="preserve"> </w:t>
       </w:r>
     </w:p>
@@ -1369,14 +1422,23 @@
     </w:p>
     <w:p/>
     <w:p>
-      <w:r>
-        <w:rPr>
-          <w:b/>
-          <w:bCs/>
+      <w:pPr>
+        <w:rPr>
+          <w:color w:val="EE0000"/>
+        </w:rPr>
+      </w:pPr>
+      <w:r>
+        <w:rPr>
+          <w:b/>
+          <w:bCs/>
+          <w:color w:val="EE0000"/>
         </w:rPr>
         <w:t>HU-10</w:t>
       </w:r>
       <w:r>
+        <w:rPr>
+          <w:color w:val="EE0000"/>
+        </w:rPr>
         <w:t xml:space="preserve"> </w:t>
       </w:r>
     </w:p>
@@ -6693,6 +6755,7 @@
   <w:style w:type="character" w:default="1" w:styleId="Fuentedeprrafopredeter">
     <w:name w:val="Default Paragraph Font"/>
     <w:uiPriority w:val="1"/>
+    <w:semiHidden/>
     <w:unhideWhenUsed/>
   </w:style>
   <w:style w:type="table" w:default="1" w:styleId="Tablanormal">

</xml_diff>